<commit_message>
add: 1. kısım bitti
</commit_message>
<xml_diff>
--- a/YBS370_SRS_Sablonu.docx
+++ b/YBS370_SRS_Sablonu.docx
@@ -515,10 +515,7 @@
     </w:p>
     <w:p>
       <w:r>
-        <w:t>*</w:t>
-      </w:r>
-      <w:r>
-        <w:t>Bu bölümde projenin neden geliştirildiği, hangi probleme çözüm sunduğu ve belgenin amacı açıklanır.</w:t>
+        <w:t>*Bu bölümde projenin neden geliştirildiği, hangi probleme çözüm sunduğu ve belgenin amacı açıklanır.</w:t>
       </w:r>
     </w:p>
     <w:p>
@@ -562,10 +559,7 @@
     </w:p>
     <w:p>
       <w:r>
-        <w:t>*</w:t>
-      </w:r>
-      <w:r>
-        <w:t>Ürünün temel işlevi, hedef kullanıcı kitlesi ve sınırları özetlenir.</w:t>
+        <w:t>*Ürünün temel işlevi, hedef kullanıcı kitlesi ve sınırları özetlenir.</w:t>
       </w:r>
     </w:p>
     <w:p>
@@ -581,57 +575,42 @@
         <w:t>Projeye özgü kavramlar, teknik terimler ve kısaltmalar listelenir.</w:t>
       </w:r>
     </w:p>
+    <w:p/>
     <w:p>
       <w:r>
         <w:lastRenderedPageBreak/>
-        <w:t>Sadakat Puanı:</w:t>
-      </w:r>
-      <w:r>
-        <w:t xml:space="preserve"> Kullanıcıların maçlara katılım devamlılıklarını </w:t>
-      </w:r>
-      <w:r>
-        <w:t>100</w:t>
-      </w:r>
-      <w:r>
-        <w:t xml:space="preserve">’lük bir puan dilimiyle </w:t>
-      </w:r>
-      <w:r>
-        <w:t xml:space="preserve">değerlendirilerek </w:t>
-      </w:r>
-      <w:r>
-        <w:t>ölçen bir puanlama sistemidir.Maç katılımına onay verdikten sonra kullanıcı maça katılmazsa sadakat puanı azalır.</w:t>
+        <w:t xml:space="preserve">Oyuncu Değerleme: </w:t>
+      </w:r>
+      <w:r>
+        <w:t>S</w:t>
+      </w:r>
+      <w:r>
+        <w:t>por dalıyla ilgilenen oyuncunun, daha önceki maç deneyimlerinin ve yetenek düzeyinin harmanlanarak değerlenmesidir. Bu değerleme sonucunda, kullanıcının katıldığı her bir maç için Yetenek Puanı ve bu maçlara katılım düzeyi ile belirlenen Sadakat Puanı oluşur. Yetenek Puanı; oyuncunun o maç için kendi takım arkadaşlarından ve rakip takım oyuncularından aldığı puanı ifade eder. Sadakat Puanı ise şöyle hesaplanır:</w:t>
       </w:r>
     </w:p>
     <w:p>
       <w:r>
-        <w:t xml:space="preserve">Yetenek Puanı: </w:t>
-      </w:r>
-      <w:r>
-        <w:t>Kullanıcının maç içerisinde göstermiş olduğu performans doğrultusu ile takım arkadaşlarının belirli kısıtlar altında verdikleri puanların ortalamasıyla oluşan 5 üzerinden bir puanlama sistemidir</w:t>
+        <w:t>o</w:t>
+      </w:r>
+      <w:r>
+        <w:tab/>
+        <w:t xml:space="preserve">Kullanıcının Katıldığı Maç Sayısı / Kullanıcının Katılmayı Taahhüt Ettiği Maç Sayısı. </w:t>
       </w:r>
     </w:p>
     <w:p>
       <w:r>
-        <w:t>Matchmaker:</w:t>
-      </w:r>
-      <w:r>
-        <w:t xml:space="preserve"> </w:t>
-      </w:r>
-      <w:r>
-        <w:t>Belirli</w:t>
-      </w:r>
-      <w:r>
-        <w:t xml:space="preserve"> filtrelerin uygulanmasıyla antrenman / maç eventlerinin </w:t>
-      </w:r>
-      <w:r>
-        <w:t xml:space="preserve">kullanıcının tercihine göre </w:t>
-      </w:r>
-      <w:r>
-        <w:t>gösterileceği kısımdır.</w:t>
+        <w:t>o</w:t>
+      </w:r>
+      <w:r>
+        <w:tab/>
+        <w:t>Her maç sonunda alınan Yetenek Puanı, kullanıcının Genel Yetenek Puanına eklenir.</w:t>
       </w:r>
     </w:p>
     <w:p>
       <w:r>
+        <w:t xml:space="preserve">Maç Kurma: Belirli bir spor dalında bir oyun oynanacak olsun. Bu oyun için için gerekli olan kişi sayısının sağlanamadığı ve bulunan potansiyel oyuncuların istenen yetenek düzeyinde olmadığı varsayılsın. Maç, uygulamanın bu işlevi sayesinde kendisinin ve takımının, aynı zamanda rakip takımın yetenek düzeyine uygun oyuncuyu bulamadığı durumda bu işlevi kullanır. </w:t>
+      </w:r>
+      <w:r>
         <w:t xml:space="preserve">Oyuncu: </w:t>
       </w:r>
       <w:r>
@@ -658,30 +637,51 @@
       <w:r>
         <w:t xml:space="preserve">İstatistikler: </w:t>
       </w:r>
+      <w:r>
+        <w:t>Kullanıcının son oynadığı maça kadar, maçlarında göstermiş olduğu istatistikler toplamıdır.</w:t>
+      </w:r>
     </w:p>
     <w:p>
       <w:r>
         <w:t>Profil:</w:t>
       </w:r>
+      <w:r>
+        <w:t>Kullanıcının adı, mevkisi,rank seviyesi, amatör/profesyonel oyuncu olması  , istatistikleri, sadakat puanı ve yetenek puanlarının yer aldığı alandır.</w:t>
+      </w:r>
     </w:p>
     <w:p>
       <w:r>
         <w:t>Keşfet:</w:t>
       </w:r>
+      <w:r>
+        <w:t xml:space="preserve"> Kullanıcıların maç anlarını , düşüncelerini , birbirleriyle haberleşmek için kullandığı oyuncu topluluğudur.</w:t>
+      </w:r>
     </w:p>
     <w:p>
       <w:r>
         <w:t xml:space="preserve">Sohbet: </w:t>
       </w:r>
+      <w:r>
+        <w:t xml:space="preserve">Kullanıcıların </w:t>
+      </w:r>
+      <w:r>
+        <w:t>birbirleriyle mesajlaşmak için kullandığı bölümdür.</w:t>
+      </w:r>
     </w:p>
     <w:p>
       <w:r>
         <w:t>Sertifakalar:</w:t>
       </w:r>
+      <w:r>
+        <w:t xml:space="preserve"> Kullanıcının amatör / profesyonel oyuncu ayrımının yapıldığı bölümdür. Sertifikası olan kullanıcı yarı profesyonel / profesyonel olarak kabul edilir.</w:t>
+      </w:r>
     </w:p>
     <w:p>
       <w:r>
         <w:t>Event:</w:t>
+      </w:r>
+      <w:r>
+        <w:t xml:space="preserve"> Antrenman ve maç aktivitelerinin toplu gösterildiği bölümdür.</w:t>
       </w:r>
     </w:p>
     <w:p>
@@ -710,10 +710,7 @@
         <w:t xml:space="preserve">Belgenin öncelikli olarak Giriş kısımında amaç; </w:t>
       </w:r>
       <w:r>
-        <w:t>projenin neden geliştirildiği, hangi probleme çözüm sunduğu ve belgenin amacı açıklanır</w:t>
-      </w:r>
-      <w:r>
-        <w:t>. Sonrasında kapsam, tanımlar / kısaltmalar / terimler ve referanslar detaylı bir şekilde açıklanacaktır.</w:t>
+        <w:t>projenin neden geliştirildiği, hangi probleme çözüm sunduğu ve belgenin amacı açıklanır. Sonrasında kapsam, tanımlar / kısaltmalar / terimler ve referanslar detaylı bir şekilde açıklanacaktır.</w:t>
       </w:r>
     </w:p>
     <w:p>
@@ -724,10 +721,7 @@
         <w:t xml:space="preserve"> </w:t>
       </w:r>
       <w:r>
-        <w:t>Sistem mevcut bir sistemin devamı mı, bağımsız bir ürün mü, başka sistemlerle ilişkisi var mı açıklanır.</w:t>
-      </w:r>
-      <w:r>
-        <w:t xml:space="preserve"> Devamında ürün fonksiyonları, kullanıcı sınıfları ve özellikleri, çalışma ortamı, tasarım ve uygulama kısıtları , varsayımlar ve bağımlılıklar detaylı bir şekilde açıklanacaktır.</w:t>
+        <w:t>Sistem mevcut bir sistemin devamı mı, bağımsız bir ürün mü, başka sistemlerle ilişkisi var mı açıklanır. Devamında ürün fonksiyonları, kullanıcı sınıfları ve özellikleri, çalışma ortamı, tasarım ve uygulama kısıtları , varsayımlar ve bağımlılıklar detaylı bir şekilde açıklanacaktır.</w:t>
       </w:r>
     </w:p>
     <w:p>
@@ -745,6 +739,7 @@
     </w:p>
     <w:p>
       <w:r>
+        <w:lastRenderedPageBreak/>
         <w:t>Fonksiyonel Olmayan Gereksinimler kısımında performans, güvenlik, kullanılabilirlik, güvenilirlik ve hata toleransı, bakım yapılabilirlik, taşınabilirlik detaylı bir şekilde açıklanacaktır.</w:t>
       </w:r>
     </w:p>
@@ -755,15 +750,11 @@
     </w:p>
     <w:p>
       <w:r>
-        <w:t xml:space="preserve">İş Kuralları ve Senaryolar kısımında temel iş kuralları, temel iş kuralları/use case’ler </w:t>
-      </w:r>
-      <w:r>
-        <w:t>detaylı bir şekilde açıklanacaktır.</w:t>
+        <w:t>İş Kuralları ve Senaryolar kısımında temel iş kuralları, temel iş kuralları/use case’ler detaylı bir şekilde açıklanacaktır.</w:t>
       </w:r>
     </w:p>
     <w:p>
       <w:r>
-        <w:lastRenderedPageBreak/>
         <w:t xml:space="preserve">Riskler Sınırlar ve Açık Noktalar kısımında riskler, </w:t>
       </w:r>
       <w:r>
@@ -773,18 +764,12 @@
         <w:t>, açık sor</w:t>
       </w:r>
       <w:r>
-        <w:t xml:space="preserve">ular </w:t>
-      </w:r>
-      <w:r>
-        <w:t>detaylı bir şekilde açıklanacaktır.</w:t>
+        <w:t>ular detaylı bir şekilde açıklanacaktır.</w:t>
       </w:r>
     </w:p>
     <w:p>
       <w:r>
-        <w:t xml:space="preserve">Ekler kısımında ekler taslakları, diyagramlar </w:t>
-      </w:r>
-      <w:r>
-        <w:t>detaylı bir şekilde açıklanacaktır.</w:t>
+        <w:t>Ekler kısımında ekler taslakları, diyagramlar detaylı bir şekilde açıklanacaktır.</w:t>
       </w:r>
     </w:p>
     <w:p>
@@ -935,6 +920,7 @@
         <w:pStyle w:val="Balk2"/>
       </w:pPr>
       <w:r>
+        <w:lastRenderedPageBreak/>
         <w:t>3.4 İletişim Arayüzleri</w:t>
       </w:r>
     </w:p>
@@ -971,7 +957,6 @@
     </w:p>
     <w:p>
       <w:r>
-        <w:lastRenderedPageBreak/>
         <w:t>Önkoşullar:</w:t>
       </w:r>
     </w:p>
@@ -1120,6 +1105,7 @@
         <w:pStyle w:val="Balk2"/>
       </w:pPr>
       <w:r>
+        <w:lastRenderedPageBreak/>
         <w:t>5.3 Kullanılabilirlik</w:t>
       </w:r>
     </w:p>
@@ -1159,7 +1145,6 @@
         <w:pStyle w:val="Balk2"/>
       </w:pPr>
       <w:r>
-        <w:lastRenderedPageBreak/>
         <w:t>5.6 Taşınabilirlik</w:t>
       </w:r>
     </w:p>
@@ -1322,6 +1307,7 @@
         <w:pStyle w:val="Balk2"/>
       </w:pPr>
       <w:r>
+        <w:lastRenderedPageBreak/>
         <w:t>9.2 Diyagramlar</w:t>
       </w:r>
     </w:p>
@@ -1501,7 +1487,6 @@
               <w:rPr>
                 <w:sz w:val="20"/>
               </w:rPr>
-              <w:lastRenderedPageBreak/>
               <w:t>FR-02</w:t>
             </w:r>
           </w:p>

</xml_diff>

<commit_message>
add: Gözükecek mi? at 2.1.
</commit_message>
<xml_diff>
--- a/YBS370_SRS_Sablonu.docx
+++ b/YBS370_SRS_Sablonu.docx
@@ -579,13 +579,7 @@
     <w:p>
       <w:r>
         <w:lastRenderedPageBreak/>
-        <w:t xml:space="preserve">Oyuncu Değerleme: </w:t>
-      </w:r>
-      <w:r>
-        <w:t>S</w:t>
-      </w:r>
-      <w:r>
-        <w:t>por dalıyla ilgilenen oyuncunun, daha önceki maç deneyimlerinin ve yetenek düzeyinin harmanlanarak değerlenmesidir. Bu değerleme sonucunda, kullanıcının katıldığı her bir maç için Yetenek Puanı ve bu maçlara katılım düzeyi ile belirlenen Sadakat Puanı oluşur. Yetenek Puanı; oyuncunun o maç için kendi takım arkadaşlarından ve rakip takım oyuncularından aldığı puanı ifade eder. Sadakat Puanı ise şöyle hesaplanır:</w:t>
+        <w:t>Oyuncu Değerleme: Spor dalıyla ilgilenen oyuncunun, daha önceki maç deneyimlerinin ve yetenek düzeyinin harmanlanarak değerlenmesidir. Bu değerleme sonucunda, kullanıcının katıldığı her bir maç için Yetenek Puanı ve bu maçlara katılım düzeyi ile belirlenen Sadakat Puanı oluşur. Yetenek Puanı; oyuncunun o maç için kendi takım arkadaşlarından ve rakip takım oyuncularından aldığı puanı ifade eder. Sadakat Puanı ise şöyle hesaplanır:</w:t>
       </w:r>
     </w:p>
     <w:p>
@@ -799,8 +793,11 @@
       </w:r>
     </w:p>
     <w:p>
-      <w:r>
-        <w:t>Sistem mevcut bir sistemin devamı mı, bağımsız bir ürün mü, başka sistemlerle ilişkisi var mı açıklanır.</w:t>
+      <w:pPr>
+        <w:pStyle w:val="Balk2"/>
+      </w:pPr>
+      <w:r>
+        <w:t>Gözükecek mi?</w:t>
       </w:r>
     </w:p>
     <w:p>

</xml_diff>

<commit_message>
fix: gözükecek mi? kısmını sil
</commit_message>
<xml_diff>
--- a/YBS370_SRS_Sablonu.docx
+++ b/YBS370_SRS_Sablonu.docx
@@ -528,10 +528,18 @@
     </w:p>
     <w:p>
       <w:r>
-        <w:t xml:space="preserve">Uygulamanın temel işlevi </w:t>
-      </w:r>
-      <w:r>
-        <w:t>, spor yapmak isteyen bireylerin karşılaştığı ekip bulma, güvenilir partner bulma ve sportif performansın takibi</w:t>
+        <w:t xml:space="preserve">Uygulamanın temel </w:t>
+      </w:r>
+      <w:proofErr w:type="gramStart"/>
+      <w:r>
+        <w:t xml:space="preserve">işlevi </w:t>
+      </w:r>
+      <w:r>
+        <w:t>,</w:t>
+      </w:r>
+      <w:proofErr w:type="gramEnd"/>
+      <w:r>
+        <w:t xml:space="preserve"> spor yapmak isteyen bireylerin karşılaştığı ekip bulma, güvenilir partner bulma ve sportif performansın takibi</w:t>
       </w:r>
       <w:r>
         <w:t xml:space="preserve"> gibi</w:t>
@@ -624,7 +632,15 @@
         <w:t>Rank Sistemi:</w:t>
       </w:r>
       <w:r>
-        <w:t xml:space="preserve"> Kullanıcının katıldığı maçlarda kazanma oranına göre , kullanıcıyı belirli bir seviye grubuna atayan sistemdir.</w:t>
+        <w:t xml:space="preserve"> Kullanıcının katıldığı maçlarda kazanma oranına </w:t>
+      </w:r>
+      <w:proofErr w:type="gramStart"/>
+      <w:r>
+        <w:t>göre ,</w:t>
+      </w:r>
+      <w:proofErr w:type="gramEnd"/>
+      <w:r>
+        <w:t xml:space="preserve"> kullanıcıyı belirli bir seviye grubuna atayan sistemdir.</w:t>
       </w:r>
     </w:p>
     <w:p>
@@ -636,11 +652,32 @@
       </w:r>
     </w:p>
     <w:p>
+      <w:proofErr w:type="gramStart"/>
       <w:r>
         <w:t>Profil:</w:t>
       </w:r>
       <w:r>
-        <w:t>Kullanıcının adı, mevkisi,rank seviyesi, amatör/profesyonel oyuncu olması  , istatistikleri, sadakat puanı ve yetenek puanlarının yer aldığı alandır.</w:t>
+        <w:t>Kullanıcının</w:t>
+      </w:r>
+      <w:proofErr w:type="gramEnd"/>
+      <w:r>
+        <w:t xml:space="preserve"> adı, </w:t>
+      </w:r>
+      <w:proofErr w:type="gramStart"/>
+      <w:r>
+        <w:t>mevkisi,rank</w:t>
+      </w:r>
+      <w:proofErr w:type="gramEnd"/>
+      <w:r>
+        <w:t xml:space="preserve"> seviyesi, amatör/profesyonel oyuncu </w:t>
+      </w:r>
+      <w:proofErr w:type="gramStart"/>
+      <w:r>
+        <w:t>olması  ,</w:t>
+      </w:r>
+      <w:proofErr w:type="gramEnd"/>
+      <w:r>
+        <w:t xml:space="preserve"> istatistikleri, sadakat puanı ve yetenek puanlarının yer aldığı alandır.</w:t>
       </w:r>
     </w:p>
     <w:p>
@@ -648,7 +685,23 @@
         <w:t>Keşfet:</w:t>
       </w:r>
       <w:r>
-        <w:t xml:space="preserve"> Kullanıcıların maç anlarını , düşüncelerini , birbirleriyle haberleşmek için kullandığı oyuncu topluluğudur.</w:t>
+        <w:t xml:space="preserve"> Kullanıcıların maç </w:t>
+      </w:r>
+      <w:proofErr w:type="gramStart"/>
+      <w:r>
+        <w:t>anlarını ,</w:t>
+      </w:r>
+      <w:proofErr w:type="gramEnd"/>
+      <w:r>
+        <w:t xml:space="preserve"> </w:t>
+      </w:r>
+      <w:proofErr w:type="gramStart"/>
+      <w:r>
+        <w:t>düşüncelerini ,</w:t>
+      </w:r>
+      <w:proofErr w:type="gramEnd"/>
+      <w:r>
+        <w:t xml:space="preserve"> birbirleriyle haberleşmek için kullandığı oyuncu topluluğudur.</w:t>
       </w:r>
     </w:p>
     <w:p>
@@ -709,13 +762,34 @@
     </w:p>
     <w:p>
       <w:r>
-        <w:t>Genel Tanım kısımında  ürün perspektifi ;</w:t>
-      </w:r>
+        <w:t xml:space="preserve">Genel Tanım </w:t>
+      </w:r>
+      <w:proofErr w:type="gramStart"/>
+      <w:r>
+        <w:t>kısımında  ürün</w:t>
+      </w:r>
+      <w:proofErr w:type="gramEnd"/>
       <w:r>
         <w:t xml:space="preserve"> </w:t>
       </w:r>
-      <w:r>
-        <w:t>Sistem mevcut bir sistemin devamı mı, bağımsız bir ürün mü, başka sistemlerle ilişkisi var mı açıklanır. Devamında ürün fonksiyonları, kullanıcı sınıfları ve özellikleri, çalışma ortamı, tasarım ve uygulama kısıtları , varsayımlar ve bağımlılıklar detaylı bir şekilde açıklanacaktır.</w:t>
+      <w:proofErr w:type="gramStart"/>
+      <w:r>
+        <w:t>perspektifi ;</w:t>
+      </w:r>
+      <w:proofErr w:type="gramEnd"/>
+      <w:r>
+        <w:t xml:space="preserve"> </w:t>
+      </w:r>
+      <w:r>
+        <w:t xml:space="preserve">Sistem mevcut bir sistemin devamı mı, bağımsız bir ürün mü, başka sistemlerle ilişkisi var mı açıklanır. Devamında ürün fonksiyonları, kullanıcı sınıfları ve özellikleri, çalışma ortamı, tasarım ve uygulama </w:t>
+      </w:r>
+      <w:proofErr w:type="gramStart"/>
+      <w:r>
+        <w:t>kısıtları ,</w:t>
+      </w:r>
+      <w:proofErr w:type="gramEnd"/>
+      <w:r>
+        <w:t xml:space="preserve"> varsayımlar ve bağımlılıklar detaylı bir şekilde açıklanacaktır.</w:t>
       </w:r>
     </w:p>
     <w:p>
@@ -797,7 +871,12 @@
         <w:pStyle w:val="Balk2"/>
       </w:pPr>
       <w:r>
-        <w:t>Gözükecek mi?</w:t>
+        <w:t>2.2 Ürün Fonksiyonları</w:t>
+      </w:r>
+    </w:p>
+    <w:p>
+      <w:r>
+        <w:t>Sistemin ana fonksiyonları yüksek seviyede listelenir.</w:t>
       </w:r>
     </w:p>
     <w:p>
@@ -805,12 +884,12 @@
         <w:pStyle w:val="Balk2"/>
       </w:pPr>
       <w:r>
-        <w:t>2.2 Ürün Fonksiyonları</w:t>
+        <w:t>2.3 Kullanıcı Sınıfları ve Özellikleri</w:t>
       </w:r>
     </w:p>
     <w:p>
       <w:r>
-        <w:t>Sistemin ana fonksiyonları yüksek seviyede listelenir.</w:t>
+        <w:t>Sistemi kullanacak kullanıcı tipleri ve temel özellikleri açıklanır.</w:t>
       </w:r>
     </w:p>
     <w:p>
@@ -818,12 +897,12 @@
         <w:pStyle w:val="Balk2"/>
       </w:pPr>
       <w:r>
-        <w:t>2.3 Kullanıcı Sınıfları ve Özellikleri</w:t>
+        <w:t>2.4 Çalışma Ortamı</w:t>
       </w:r>
     </w:p>
     <w:p>
       <w:r>
-        <w:t>Sistemi kullanacak kullanıcı tipleri ve temel özellikleri açıklanır.</w:t>
+        <w:t>Yazılımın hedef platformu: web, mobil, masaüstü, işletim sistemi, tarayıcı vb.</w:t>
       </w:r>
     </w:p>
     <w:p>
@@ -831,12 +910,12 @@
         <w:pStyle w:val="Balk2"/>
       </w:pPr>
       <w:r>
-        <w:t>2.4 Çalışma Ortamı</w:t>
+        <w:t>2.5 Tasarım ve Uygulama Kısıtları</w:t>
       </w:r>
     </w:p>
     <w:p>
       <w:r>
-        <w:t>Yazılımın hedef platformu: web, mobil, masaüstü, işletim sistemi, tarayıcı vb.</w:t>
+        <w:t>Teknoloji seçimi, zaman, bütçe, yasal zorunluluklar, entegrasyon kısıtları vb.</w:t>
       </w:r>
     </w:p>
     <w:p>
@@ -844,12 +923,20 @@
         <w:pStyle w:val="Balk2"/>
       </w:pPr>
       <w:r>
-        <w:t>2.5 Tasarım ve Uygulama Kısıtları</w:t>
+        <w:t>2.6 Varsayımlar ve Bağımlılıklar</w:t>
       </w:r>
     </w:p>
     <w:p>
       <w:r>
-        <w:t>Teknoloji seçimi, zaman, bütçe, yasal zorunluluklar, entegrasyon kısıtları vb.</w:t>
+        <w:t>Projeye ilişkin kabul ve dış bağımlılıklar belirtilir.</w:t>
+      </w:r>
+    </w:p>
+    <w:p>
+      <w:pPr>
+        <w:pStyle w:val="Balk1"/>
+      </w:pPr>
+      <w:r>
+        <w:t>3. Dış Arayüz Gereksinimleri</w:t>
       </w:r>
     </w:p>
     <w:p>
@@ -857,12 +944,51 @@
         <w:pStyle w:val="Balk2"/>
       </w:pPr>
       <w:r>
-        <w:t>2.6 Varsayımlar ve Bağımlılıklar</w:t>
+        <w:t>3.1 Kullanıcı Arayüzleri</w:t>
       </w:r>
     </w:p>
     <w:p>
       <w:r>
-        <w:t>Projeye ilişkin kabul ve dış bağımlılıklar belirtilir.</w:t>
+        <w:t>Ekranlar, gezinme yapısı, önemli sayfalar, tasarım ilkeleri.</w:t>
+      </w:r>
+    </w:p>
+    <w:p>
+      <w:pPr>
+        <w:pStyle w:val="Balk2"/>
+      </w:pPr>
+      <w:r>
+        <w:t>3.2 Donanım Arayüzleri</w:t>
+      </w:r>
+    </w:p>
+    <w:p>
+      <w:r>
+        <w:t>Gerekliyse cihaz, sensör, barkod okuyucu vb. ile ilişkiler.</w:t>
+      </w:r>
+    </w:p>
+    <w:p>
+      <w:pPr>
+        <w:pStyle w:val="Balk2"/>
+      </w:pPr>
+      <w:r>
+        <w:t>3.3 Yazılım Arayüzleri</w:t>
+      </w:r>
+    </w:p>
+    <w:p>
+      <w:r>
+        <w:t>Veritabanı, API, üçüncü taraf servisler, kütüphaneler.</w:t>
+      </w:r>
+    </w:p>
+    <w:p>
+      <w:pPr>
+        <w:pStyle w:val="Balk2"/>
+      </w:pPr>
+      <w:r>
+        <w:t>3.4 İletişim Arayüzleri</w:t>
+      </w:r>
+    </w:p>
+    <w:p>
+      <w:r>
+        <w:t>Ağ protokolleri, veri formatları, mesajlaşma altyapıları.</w:t>
       </w:r>
     </w:p>
     <w:p>
@@ -870,7 +996,8 @@
         <w:pStyle w:val="Balk1"/>
       </w:pPr>
       <w:r>
-        <w:t>3. Dış Arayüz Gereksinimleri</w:t>
+        <w:lastRenderedPageBreak/>
+        <w:t>4. Sistem Özellikleri / Fonksiyonel Gereksinimler</w:t>
       </w:r>
     </w:p>
     <w:p>
@@ -878,12 +1005,42 @@
         <w:pStyle w:val="Balk2"/>
       </w:pPr>
       <w:r>
-        <w:t>3.1 Kullanıcı Arayüzleri</w:t>
+        <w:t>4.1 Fonksiyon 1</w:t>
       </w:r>
     </w:p>
     <w:p>
       <w:r>
-        <w:t>Ekranlar, gezinme yapısı, önemli sayfalar, tasarım ilkeleri.</w:t>
+        <w:t>Fonksiyon adı: ................................................</w:t>
+      </w:r>
+    </w:p>
+    <w:p>
+      <w:r>
+        <w:t>Açıklama:</w:t>
+      </w:r>
+    </w:p>
+    <w:p>
+      <w:r>
+        <w:t>Önkoşullar:</w:t>
+      </w:r>
+    </w:p>
+    <w:p>
+      <w:r>
+        <w:t>Girdi:</w:t>
+      </w:r>
+    </w:p>
+    <w:p>
+      <w:r>
+        <w:t>İşlem:</w:t>
+      </w:r>
+    </w:p>
+    <w:p>
+      <w:r>
+        <w:t>Çıktı:</w:t>
+      </w:r>
+    </w:p>
+    <w:p>
+      <w:r>
+        <w:t>Sonuç / İş Kuralı:</w:t>
       </w:r>
     </w:p>
     <w:p>
@@ -891,12 +1048,42 @@
         <w:pStyle w:val="Balk2"/>
       </w:pPr>
       <w:r>
-        <w:t>3.2 Donanım Arayüzleri</w:t>
+        <w:t>4.2 Fonksiyon 2</w:t>
       </w:r>
     </w:p>
     <w:p>
       <w:r>
-        <w:t>Gerekliyse cihaz, sensör, barkod okuyucu vb. ile ilişkiler.</w:t>
+        <w:t>Fonksiyon adı: ................................................</w:t>
+      </w:r>
+    </w:p>
+    <w:p>
+      <w:r>
+        <w:t>Açıklama:</w:t>
+      </w:r>
+    </w:p>
+    <w:p>
+      <w:r>
+        <w:t>Önkoşullar:</w:t>
+      </w:r>
+    </w:p>
+    <w:p>
+      <w:r>
+        <w:t>Girdi:</w:t>
+      </w:r>
+    </w:p>
+    <w:p>
+      <w:r>
+        <w:t>İşlem:</w:t>
+      </w:r>
+    </w:p>
+    <w:p>
+      <w:r>
+        <w:t>Çıktı:</w:t>
+      </w:r>
+    </w:p>
+    <w:p>
+      <w:r>
+        <w:t>Sonuç / İş Kuralı:</w:t>
       </w:r>
     </w:p>
     <w:p>
@@ -904,12 +1091,50 @@
         <w:pStyle w:val="Balk2"/>
       </w:pPr>
       <w:r>
-        <w:t>3.3 Yazılım Arayüzleri</w:t>
+        <w:t>4.3 Fonksiyon 3</w:t>
       </w:r>
     </w:p>
     <w:p>
       <w:r>
-        <w:t>Veritabanı, API, üçüncü taraf servisler, kütüphaneler.</w:t>
+        <w:t>Fonksiyon adı: ................................................</w:t>
+      </w:r>
+    </w:p>
+    <w:p>
+      <w:r>
+        <w:t>Açıklama:</w:t>
+      </w:r>
+    </w:p>
+    <w:p>
+      <w:r>
+        <w:t>Önkoşullar:</w:t>
+      </w:r>
+    </w:p>
+    <w:p>
+      <w:r>
+        <w:t>Girdi:</w:t>
+      </w:r>
+    </w:p>
+    <w:p>
+      <w:r>
+        <w:t>İşlem:</w:t>
+      </w:r>
+    </w:p>
+    <w:p>
+      <w:r>
+        <w:t>Çıktı:</w:t>
+      </w:r>
+    </w:p>
+    <w:p>
+      <w:r>
+        <w:t>Sonuç / İş Kuralı:</w:t>
+      </w:r>
+    </w:p>
+    <w:p>
+      <w:pPr>
+        <w:pStyle w:val="Balk1"/>
+      </w:pPr>
+      <w:r>
+        <w:t>5. Fonksiyonel Olmayan Gereksinimler</w:t>
       </w:r>
     </w:p>
     <w:p>
@@ -917,13 +1142,78 @@
         <w:pStyle w:val="Balk2"/>
       </w:pPr>
       <w:r>
-        <w:lastRenderedPageBreak/>
-        <w:t>3.4 İletişim Arayüzleri</w:t>
+        <w:t>5.1 Performans</w:t>
       </w:r>
     </w:p>
     <w:p>
       <w:r>
-        <w:t>Ağ protokolleri, veri formatları, mesajlaşma altyapıları.</w:t>
+        <w:t>Tepki süresi, eşzamanlı kullanıcı sayısı, işlem hacmi vb.</w:t>
+      </w:r>
+    </w:p>
+    <w:p>
+      <w:pPr>
+        <w:pStyle w:val="Balk2"/>
+      </w:pPr>
+      <w:r>
+        <w:t>5.2 Güvenlik</w:t>
+      </w:r>
+    </w:p>
+    <w:p>
+      <w:r>
+        <w:t>Kimlik doğrulama, yetkilendirme, veri gizliliği, loglama.</w:t>
+      </w:r>
+    </w:p>
+    <w:p>
+      <w:pPr>
+        <w:pStyle w:val="Balk2"/>
+      </w:pPr>
+      <w:r>
+        <w:t>5.3 Kullanılabilirlik</w:t>
+      </w:r>
+    </w:p>
+    <w:p>
+      <w:r>
+        <w:t>Öğrenilebilirlik, erişilebilirlik, kullanıcı deneyimi ilkeleri.</w:t>
+      </w:r>
+    </w:p>
+    <w:p>
+      <w:pPr>
+        <w:pStyle w:val="Balk2"/>
+      </w:pPr>
+      <w:r>
+        <w:lastRenderedPageBreak/>
+        <w:t>5.4 Güvenilirlik ve Hata Toleransı</w:t>
+      </w:r>
+    </w:p>
+    <w:p>
+      <w:r>
+        <w:t>Yedeklilik, hata durumları, veri kaybı önleme.</w:t>
+      </w:r>
+    </w:p>
+    <w:p>
+      <w:pPr>
+        <w:pStyle w:val="Balk2"/>
+      </w:pPr>
+      <w:r>
+        <w:t>5.5 Bakım Yapılabilirlik</w:t>
+      </w:r>
+    </w:p>
+    <w:p>
+      <w:r>
+        <w:t>Kod yapısı, modülerlik, dokümantasyon, test edilebilirlik.</w:t>
+      </w:r>
+    </w:p>
+    <w:p>
+      <w:pPr>
+        <w:pStyle w:val="Balk2"/>
+      </w:pPr>
+      <w:r>
+        <w:t>5.6 Taşınabilirlik</w:t>
+      </w:r>
+    </w:p>
+    <w:p>
+      <w:r>
+        <w:t>Farklı cihaz / platformlarda çalışabilirlik.</w:t>
       </w:r>
     </w:p>
     <w:p>
@@ -931,7 +1221,7 @@
         <w:pStyle w:val="Balk1"/>
       </w:pPr>
       <w:r>
-        <w:t>4. Sistem Özellikleri / Fonksiyonel Gereksinimler</w:t>
+        <w:t>6. Veri Gereksinimleri</w:t>
       </w:r>
     </w:p>
     <w:p>
@@ -939,42 +1229,12 @@
         <w:pStyle w:val="Balk2"/>
       </w:pPr>
       <w:r>
-        <w:t>4.1 Fonksiyon 1</w:t>
+        <w:t>6.1 Veri Sözlüğü</w:t>
       </w:r>
     </w:p>
     <w:p>
       <w:r>
-        <w:t>Fonksiyon adı: ................................................</w:t>
-      </w:r>
-    </w:p>
-    <w:p>
-      <w:r>
-        <w:t>Açıklama:</w:t>
-      </w:r>
-    </w:p>
-    <w:p>
-      <w:r>
-        <w:t>Önkoşullar:</w:t>
-      </w:r>
-    </w:p>
-    <w:p>
-      <w:r>
-        <w:t>Girdi:</w:t>
-      </w:r>
-    </w:p>
-    <w:p>
-      <w:r>
-        <w:t>İşlem:</w:t>
-      </w:r>
-    </w:p>
-    <w:p>
-      <w:r>
-        <w:t>Çıktı:</w:t>
-      </w:r>
-    </w:p>
-    <w:p>
-      <w:r>
-        <w:t>Sonuç / İş Kuralı:</w:t>
+        <w:t>Temel veri öğeleri ve açıklamaları listelenir.</w:t>
       </w:r>
     </w:p>
     <w:p>
@@ -982,42 +1242,12 @@
         <w:pStyle w:val="Balk2"/>
       </w:pPr>
       <w:r>
-        <w:t>4.2 Fonksiyon 2</w:t>
+        <w:t>6.2 Varlıklar / Tablolar</w:t>
       </w:r>
     </w:p>
     <w:p>
       <w:r>
-        <w:t>Fonksiyon adı: ................................................</w:t>
-      </w:r>
-    </w:p>
-    <w:p>
-      <w:r>
-        <w:t>Açıklama:</w:t>
-      </w:r>
-    </w:p>
-    <w:p>
-      <w:r>
-        <w:t>Önkoşullar:</w:t>
-      </w:r>
-    </w:p>
-    <w:p>
-      <w:r>
-        <w:t>Girdi:</w:t>
-      </w:r>
-    </w:p>
-    <w:p>
-      <w:r>
-        <w:t>İşlem:</w:t>
-      </w:r>
-    </w:p>
-    <w:p>
-      <w:r>
-        <w:t>Çıktı:</w:t>
-      </w:r>
-    </w:p>
-    <w:p>
-      <w:r>
-        <w:t>Sonuç / İş Kuralı:</w:t>
+        <w:t>Başlıca veri yapıları tanımlanır.</w:t>
       </w:r>
     </w:p>
     <w:p>
@@ -1025,42 +1255,12 @@
         <w:pStyle w:val="Balk2"/>
       </w:pPr>
       <w:r>
-        <w:t>4.3 Fonksiyon 3</w:t>
+        <w:t>6.3 Veri Saklama ve Yedekleme</w:t>
       </w:r>
     </w:p>
     <w:p>
       <w:r>
-        <w:t>Fonksiyon adı: ................................................</w:t>
-      </w:r>
-    </w:p>
-    <w:p>
-      <w:r>
-        <w:t>Açıklama:</w:t>
-      </w:r>
-    </w:p>
-    <w:p>
-      <w:r>
-        <w:t>Önkoşullar:</w:t>
-      </w:r>
-    </w:p>
-    <w:p>
-      <w:r>
-        <w:t>Girdi:</w:t>
-      </w:r>
-    </w:p>
-    <w:p>
-      <w:r>
-        <w:t>İşlem:</w:t>
-      </w:r>
-    </w:p>
-    <w:p>
-      <w:r>
-        <w:t>Çıktı:</w:t>
-      </w:r>
-    </w:p>
-    <w:p>
-      <w:r>
-        <w:t>Sonuç / İş Kuralı:</w:t>
+        <w:t>Veri saklama yöntemi, yedekleme yaklaşımı.</w:t>
       </w:r>
     </w:p>
     <w:p>
@@ -1068,7 +1268,7 @@
         <w:pStyle w:val="Balk1"/>
       </w:pPr>
       <w:r>
-        <w:t>5. Fonksiyonel Olmayan Gereksinimler</w:t>
+        <w:t>7. İş Kuralları ve Senaryolar</w:t>
       </w:r>
     </w:p>
     <w:p>
@@ -1076,12 +1276,12 @@
         <w:pStyle w:val="Balk2"/>
       </w:pPr>
       <w:r>
-        <w:t>5.1 Performans</w:t>
+        <w:t>7.1 Temel İş Kuralları</w:t>
       </w:r>
     </w:p>
     <w:p>
       <w:r>
-        <w:t>Tepki süresi, eşzamanlı kullanıcı sayısı, işlem hacmi vb.</w:t>
+        <w:t>Sistemin uyması gereken iş kuralları yazılır.</w:t>
       </w:r>
     </w:p>
     <w:p>
@@ -1089,12 +1289,20 @@
         <w:pStyle w:val="Balk2"/>
       </w:pPr>
       <w:r>
-        <w:t>5.2 Güvenlik</w:t>
+        <w:t>7.2 Kullanım Senaryoları / Use Case'ler</w:t>
       </w:r>
     </w:p>
     <w:p>
       <w:r>
-        <w:t>Kimlik doğrulama, yetkilendirme, veri gizliliği, loglama.</w:t>
+        <w:t>En az 2-3 temel senaryo yazılabilir.</w:t>
+      </w:r>
+    </w:p>
+    <w:p>
+      <w:pPr>
+        <w:pStyle w:val="Balk1"/>
+      </w:pPr>
+      <w:r>
+        <w:t>8. Riskler, Sınırlar ve Açık Noktalar</w:t>
       </w:r>
     </w:p>
     <w:p>
@@ -1102,13 +1310,12 @@
         <w:pStyle w:val="Balk2"/>
       </w:pPr>
       <w:r>
-        <w:lastRenderedPageBreak/>
-        <w:t>5.3 Kullanılabilirlik</w:t>
+        <w:t>8.1 Riskler</w:t>
       </w:r>
     </w:p>
     <w:p>
       <w:r>
-        <w:t>Öğrenilebilirlik, erişilebilirlik, kullanıcı deneyimi ilkeleri.</w:t>
+        <w:t>Teknik, zaman, veri veya kullanıcı kaynaklı riskler.</w:t>
       </w:r>
     </w:p>
     <w:p>
@@ -1116,12 +1323,12 @@
         <w:pStyle w:val="Balk2"/>
       </w:pPr>
       <w:r>
-        <w:t>5.4 Güvenilirlik ve Hata Toleransı</w:t>
+        <w:t>8.2 Proje Sınırları</w:t>
       </w:r>
     </w:p>
     <w:p>
       <w:r>
-        <w:t>Yedeklilik, hata durumları, veri kaybı önleme.</w:t>
+        <w:t>Sistemin neleri yapmayacağı açıkça belirtilir.</w:t>
       </w:r>
     </w:p>
     <w:p>
@@ -1129,12 +1336,20 @@
         <w:pStyle w:val="Balk2"/>
       </w:pPr>
       <w:r>
-        <w:t>5.5 Bakım Yapılabilirlik</w:t>
+        <w:t>8.3 Açık Sorular</w:t>
       </w:r>
     </w:p>
     <w:p>
       <w:r>
-        <w:t>Kod yapısı, modülerlik, dokümantasyon, test edilebilirlik.</w:t>
+        <w:t>Henüz netleşmemiş noktalar listelenir.</w:t>
+      </w:r>
+    </w:p>
+    <w:p>
+      <w:pPr>
+        <w:pStyle w:val="Balk1"/>
+      </w:pPr>
+      <w:r>
+        <w:t>9. Ekler</w:t>
       </w:r>
     </w:p>
     <w:p>
@@ -1142,12 +1357,25 @@
         <w:pStyle w:val="Balk2"/>
       </w:pPr>
       <w:r>
-        <w:t>5.6 Taşınabilirlik</w:t>
+        <w:t>9.1 Ekran Taslakları</w:t>
       </w:r>
     </w:p>
     <w:p>
       <w:r>
-        <w:t>Farklı cihaz / platformlarda çalışabilirlik.</w:t>
+        <w:t>Basit çizimler, wireframe'ler veya örnek ekranlar.</w:t>
+      </w:r>
+    </w:p>
+    <w:p>
+      <w:pPr>
+        <w:pStyle w:val="Balk2"/>
+      </w:pPr>
+      <w:r>
+        <w:t>9.2 Diyagramlar</w:t>
+      </w:r>
+    </w:p>
+    <w:p>
+      <w:r>
+        <w:t>Use case, activity, ER, sınıf diyagramı vb.</w:t>
       </w:r>
     </w:p>
     <w:p>
@@ -1155,169 +1383,7 @@
         <w:pStyle w:val="Balk1"/>
       </w:pPr>
       <w:r>
-        <w:t>6. Veri Gereksinimleri</w:t>
-      </w:r>
-    </w:p>
-    <w:p>
-      <w:pPr>
-        <w:pStyle w:val="Balk2"/>
-      </w:pPr>
-      <w:r>
-        <w:t>6.1 Veri Sözlüğü</w:t>
-      </w:r>
-    </w:p>
-    <w:p>
-      <w:r>
-        <w:t>Temel veri öğeleri ve açıklamaları listelenir.</w:t>
-      </w:r>
-    </w:p>
-    <w:p>
-      <w:pPr>
-        <w:pStyle w:val="Balk2"/>
-      </w:pPr>
-      <w:r>
-        <w:t>6.2 Varlıklar / Tablolar</w:t>
-      </w:r>
-    </w:p>
-    <w:p>
-      <w:r>
-        <w:t>Başlıca veri yapıları tanımlanır.</w:t>
-      </w:r>
-    </w:p>
-    <w:p>
-      <w:pPr>
-        <w:pStyle w:val="Balk2"/>
-      </w:pPr>
-      <w:r>
-        <w:t>6.3 Veri Saklama ve Yedekleme</w:t>
-      </w:r>
-    </w:p>
-    <w:p>
-      <w:r>
-        <w:t>Veri saklama yöntemi, yedekleme yaklaşımı.</w:t>
-      </w:r>
-    </w:p>
-    <w:p>
-      <w:pPr>
-        <w:pStyle w:val="Balk1"/>
-      </w:pPr>
-      <w:r>
-        <w:t>7. İş Kuralları ve Senaryolar</w:t>
-      </w:r>
-    </w:p>
-    <w:p>
-      <w:pPr>
-        <w:pStyle w:val="Balk2"/>
-      </w:pPr>
-      <w:r>
-        <w:t>7.1 Temel İş Kuralları</w:t>
-      </w:r>
-    </w:p>
-    <w:p>
-      <w:r>
-        <w:t>Sistemin uyması gereken iş kuralları yazılır.</w:t>
-      </w:r>
-    </w:p>
-    <w:p>
-      <w:pPr>
-        <w:pStyle w:val="Balk2"/>
-      </w:pPr>
-      <w:r>
-        <w:t>7.2 Kullanım Senaryoları / Use Case'ler</w:t>
-      </w:r>
-    </w:p>
-    <w:p>
-      <w:r>
-        <w:t>En az 2-3 temel senaryo yazılabilir.</w:t>
-      </w:r>
-    </w:p>
-    <w:p>
-      <w:pPr>
-        <w:pStyle w:val="Balk1"/>
-      </w:pPr>
-      <w:r>
-        <w:t>8. Riskler, Sınırlar ve Açık Noktalar</w:t>
-      </w:r>
-    </w:p>
-    <w:p>
-      <w:pPr>
-        <w:pStyle w:val="Balk2"/>
-      </w:pPr>
-      <w:r>
-        <w:t>8.1 Riskler</w:t>
-      </w:r>
-    </w:p>
-    <w:p>
-      <w:r>
-        <w:t>Teknik, zaman, veri veya kullanıcı kaynaklı riskler.</w:t>
-      </w:r>
-    </w:p>
-    <w:p>
-      <w:pPr>
-        <w:pStyle w:val="Balk2"/>
-      </w:pPr>
-      <w:r>
-        <w:t>8.2 Proje Sınırları</w:t>
-      </w:r>
-    </w:p>
-    <w:p>
-      <w:r>
-        <w:t>Sistemin neleri yapmayacağı açıkça belirtilir.</w:t>
-      </w:r>
-    </w:p>
-    <w:p>
-      <w:pPr>
-        <w:pStyle w:val="Balk2"/>
-      </w:pPr>
-      <w:r>
-        <w:t>8.3 Açık Sorular</w:t>
-      </w:r>
-    </w:p>
-    <w:p>
-      <w:r>
-        <w:t>Henüz netleşmemiş noktalar listelenir.</w:t>
-      </w:r>
-    </w:p>
-    <w:p>
-      <w:pPr>
-        <w:pStyle w:val="Balk1"/>
-      </w:pPr>
-      <w:r>
-        <w:t>9. Ekler</w:t>
-      </w:r>
-    </w:p>
-    <w:p>
-      <w:pPr>
-        <w:pStyle w:val="Balk2"/>
-      </w:pPr>
-      <w:r>
-        <w:t>9.1 Ekran Taslakları</w:t>
-      </w:r>
-    </w:p>
-    <w:p>
-      <w:r>
-        <w:t>Basit çizimler, wireframe'ler veya örnek ekranlar.</w:t>
-      </w:r>
-    </w:p>
-    <w:p>
-      <w:pPr>
-        <w:pStyle w:val="Balk2"/>
-      </w:pPr>
-      <w:r>
         <w:lastRenderedPageBreak/>
-        <w:t>9.2 Diyagramlar</w:t>
-      </w:r>
-    </w:p>
-    <w:p>
-      <w:r>
-        <w:t>Use case, activity, ER, sınıf diyagramı vb.</w:t>
-      </w:r>
-    </w:p>
-    <w:p>
-      <w:pPr>
-        <w:pStyle w:val="Balk1"/>
-      </w:pPr>
-      <w:r>
         <w:t>İzlenebilirlik Özeti</w:t>
       </w:r>
     </w:p>

</xml_diff>

<commit_message>
docs: 2.1.i yeniden yükle
</commit_message>
<xml_diff>
--- a/YBS370_SRS_Sablonu.docx
+++ b/YBS370_SRS_Sablonu.docx
@@ -528,18 +528,10 @@
     </w:p>
     <w:p>
       <w:r>
-        <w:t xml:space="preserve">Uygulamanın temel </w:t>
-      </w:r>
-      <w:proofErr w:type="gramStart"/>
-      <w:r>
-        <w:t xml:space="preserve">işlevi </w:t>
-      </w:r>
-      <w:r>
-        <w:t>,</w:t>
-      </w:r>
-      <w:proofErr w:type="gramEnd"/>
-      <w:r>
-        <w:t xml:space="preserve"> spor yapmak isteyen bireylerin karşılaştığı ekip bulma, güvenilir partner bulma ve sportif performansın takibi</w:t>
+        <w:t xml:space="preserve">Uygulamanın temel işlevi </w:t>
+      </w:r>
+      <w:r>
+        <w:t>, spor yapmak isteyen bireylerin karşılaştığı ekip bulma, güvenilir partner bulma ve sportif performansın takibi</w:t>
       </w:r>
       <w:r>
         <w:t xml:space="preserve"> gibi</w:t>
@@ -632,15 +624,7 @@
         <w:t>Rank Sistemi:</w:t>
       </w:r>
       <w:r>
-        <w:t xml:space="preserve"> Kullanıcının katıldığı maçlarda kazanma oranına </w:t>
-      </w:r>
-      <w:proofErr w:type="gramStart"/>
-      <w:r>
-        <w:t>göre ,</w:t>
-      </w:r>
-      <w:proofErr w:type="gramEnd"/>
-      <w:r>
-        <w:t xml:space="preserve"> kullanıcıyı belirli bir seviye grubuna atayan sistemdir.</w:t>
+        <w:t xml:space="preserve"> Kullanıcının katıldığı maçlarda kazanma oranına göre , kullanıcıyı belirli bir seviye grubuna atayan sistemdir.</w:t>
       </w:r>
     </w:p>
     <w:p>
@@ -652,32 +636,11 @@
       </w:r>
     </w:p>
     <w:p>
-      <w:proofErr w:type="gramStart"/>
       <w:r>
         <w:t>Profil:</w:t>
       </w:r>
       <w:r>
-        <w:t>Kullanıcının</w:t>
-      </w:r>
-      <w:proofErr w:type="gramEnd"/>
-      <w:r>
-        <w:t xml:space="preserve"> adı, </w:t>
-      </w:r>
-      <w:proofErr w:type="gramStart"/>
-      <w:r>
-        <w:t>mevkisi,rank</w:t>
-      </w:r>
-      <w:proofErr w:type="gramEnd"/>
-      <w:r>
-        <w:t xml:space="preserve"> seviyesi, amatör/profesyonel oyuncu </w:t>
-      </w:r>
-      <w:proofErr w:type="gramStart"/>
-      <w:r>
-        <w:t>olması  ,</w:t>
-      </w:r>
-      <w:proofErr w:type="gramEnd"/>
-      <w:r>
-        <w:t xml:space="preserve"> istatistikleri, sadakat puanı ve yetenek puanlarının yer aldığı alandır.</w:t>
+        <w:t>Kullanıcının adı, mevkisi,rank seviyesi, amatör/profesyonel oyuncu olması  , istatistikleri, sadakat puanı ve yetenek puanlarının yer aldığı alandır.</w:t>
       </w:r>
     </w:p>
     <w:p>
@@ -685,23 +648,7 @@
         <w:t>Keşfet:</w:t>
       </w:r>
       <w:r>
-        <w:t xml:space="preserve"> Kullanıcıların maç </w:t>
-      </w:r>
-      <w:proofErr w:type="gramStart"/>
-      <w:r>
-        <w:t>anlarını ,</w:t>
-      </w:r>
-      <w:proofErr w:type="gramEnd"/>
-      <w:r>
-        <w:t xml:space="preserve"> </w:t>
-      </w:r>
-      <w:proofErr w:type="gramStart"/>
-      <w:r>
-        <w:t>düşüncelerini ,</w:t>
-      </w:r>
-      <w:proofErr w:type="gramEnd"/>
-      <w:r>
-        <w:t xml:space="preserve"> birbirleriyle haberleşmek için kullandığı oyuncu topluluğudur.</w:t>
+        <w:t xml:space="preserve"> Kullanıcıların maç anlarını , düşüncelerini , birbirleriyle haberleşmek için kullandığı oyuncu topluluğudur.</w:t>
       </w:r>
     </w:p>
     <w:p>
@@ -762,34 +709,13 @@
     </w:p>
     <w:p>
       <w:r>
-        <w:t xml:space="preserve">Genel Tanım </w:t>
-      </w:r>
-      <w:proofErr w:type="gramStart"/>
-      <w:r>
-        <w:t>kısımında  ürün</w:t>
-      </w:r>
-      <w:proofErr w:type="gramEnd"/>
+        <w:t>Genel Tanım kısımında  ürün perspektifi ;</w:t>
+      </w:r>
       <w:r>
         <w:t xml:space="preserve"> </w:t>
       </w:r>
-      <w:proofErr w:type="gramStart"/>
-      <w:r>
-        <w:t>perspektifi ;</w:t>
-      </w:r>
-      <w:proofErr w:type="gramEnd"/>
-      <w:r>
-        <w:t xml:space="preserve"> </w:t>
-      </w:r>
-      <w:r>
-        <w:t xml:space="preserve">Sistem mevcut bir sistemin devamı mı, bağımsız bir ürün mü, başka sistemlerle ilişkisi var mı açıklanır. Devamında ürün fonksiyonları, kullanıcı sınıfları ve özellikleri, çalışma ortamı, tasarım ve uygulama </w:t>
-      </w:r>
-      <w:proofErr w:type="gramStart"/>
-      <w:r>
-        <w:t>kısıtları ,</w:t>
-      </w:r>
-      <w:proofErr w:type="gramEnd"/>
-      <w:r>
-        <w:t xml:space="preserve"> varsayımlar ve bağımlılıklar detaylı bir şekilde açıklanacaktır.</w:t>
+      <w:r>
+        <w:t>Sistem mevcut bir sistemin devamı mı, bağımsız bir ürün mü, başka sistemlerle ilişkisi var mı açıklanır. Devamında ürün fonksiyonları, kullanıcı sınıfları ve özellikleri, çalışma ortamı, tasarım ve uygulama kısıtları , varsayımlar ve bağımlılıklar detaylı bir şekilde açıklanacaktır.</w:t>
       </w:r>
     </w:p>
     <w:p>
@@ -867,16 +793,128 @@
       </w:r>
     </w:p>
     <w:p>
-      <w:pPr>
-        <w:pStyle w:val="Balk2"/>
-      </w:pPr>
-      <w:r>
-        <w:t>2.2 Ürün Fonksiyonları</w:t>
+      <w:r>
+        <w:t xml:space="preserve">Matchla, mevcut herhangi bir yazılımın devamı veya modülü olmayıp, amatör spor organizasyonlarındaki boşluğu doldurmak üzere tasarlanmış bağımsız bir üründür. </w:t>
       </w:r>
     </w:p>
     <w:p>
       <w:r>
-        <w:t>Sistemin ana fonksiyonları yüksek seviyede listelenir.</w:t>
+        <w:t xml:space="preserve">Uygulama, temel olarak kendi içinde kapalı devre bir sosyal akış sistemi barındırır. Bununla beraber; belirlenmiş harici sistem ve arayüzler, uygulamanın gerçekleştireceği işlevsel fonksiyonların uygulanabilmesi için gerekli olacaktır. Bu harici sistemler ve arayüzler: </w:t>
+      </w:r>
+    </w:p>
+    <w:p>
+      <w:r>
+        <w:t>•</w:t>
+      </w:r>
+      <w:r>
+        <w:rPr>
+          <w:rFonts w:ascii="Segoe UI Symbol" w:hAnsi="Segoe UI Symbol" w:cs="Segoe UI Symbol"/>
+        </w:rPr>
+        <w:t>⁠</w:t>
+      </w:r>
+      <w:r>
+        <w:t xml:space="preserve">  </w:t>
+      </w:r>
+      <w:r>
+        <w:rPr>
+          <w:rFonts w:ascii="Segoe UI Symbol" w:hAnsi="Segoe UI Symbol" w:cs="Segoe UI Symbol"/>
+        </w:rPr>
+        <w:t>⁠</w:t>
+      </w:r>
+      <w:r>
+        <w:t>Google Maps API: Kullanıcının konumuna göre, Maç Kurucunun, kendisine en yakın sahaları harita üzerinde listelemesi, kendisine konum ve Oyuncu Puanı olarak en yakın Potansiyel Oyuncuları görüntüleyebilmesi, gerçekleştirilecek maçların lokasyonlarını doğrulaması ve bunun için navigasyon desteğinin sunulması amacıyla kullanılacaktır.</w:t>
+      </w:r>
+    </w:p>
+    <w:p>
+      <w:r>
+        <w:t>•</w:t>
+      </w:r>
+      <w:r>
+        <w:rPr>
+          <w:rFonts w:ascii="Segoe UI Symbol" w:hAnsi="Segoe UI Symbol" w:cs="Segoe UI Symbol"/>
+        </w:rPr>
+        <w:t>⁠</w:t>
+      </w:r>
+      <w:r>
+        <w:t xml:space="preserve">  </w:t>
+      </w:r>
+      <w:r>
+        <w:rPr>
+          <w:rFonts w:ascii="Segoe UI Symbol" w:hAnsi="Segoe UI Symbol" w:cs="Segoe UI Symbol"/>
+        </w:rPr>
+        <w:t>⁠</w:t>
+      </w:r>
+      <w:r>
+        <w:t>Firebase Authentication: Kullanıcının uygulamaya giriş yaparken belirtmesi gerektiği bilgileri onaylamak ve doğrulamak amacıyla kullanılacaktır.</w:t>
+      </w:r>
+    </w:p>
+    <w:p>
+      <w:r>
+        <w:t>•</w:t>
+      </w:r>
+      <w:r>
+        <w:rPr>
+          <w:rFonts w:ascii="Segoe UI Symbol" w:hAnsi="Segoe UI Symbol" w:cs="Segoe UI Symbol"/>
+        </w:rPr>
+        <w:t>⁠</w:t>
+      </w:r>
+      <w:r>
+        <w:t xml:space="preserve">  </w:t>
+      </w:r>
+      <w:r>
+        <w:rPr>
+          <w:rFonts w:ascii="Segoe UI Symbol" w:hAnsi="Segoe UI Symbol" w:cs="Segoe UI Symbol"/>
+        </w:rPr>
+        <w:t>⁠</w:t>
+      </w:r>
+      <w:r>
+        <w:t>Firebase Cloud Messaging: Kullanıcının uygulama içerisinde belirlenmiş işlevleri gerçekleştirirken kullanılacak bildirim sistemidir.</w:t>
+      </w:r>
+    </w:p>
+    <w:p>
+      <w:r>
+        <w:t>•</w:t>
+      </w:r>
+      <w:r>
+        <w:rPr>
+          <w:rFonts w:ascii="Segoe UI Symbol" w:hAnsi="Segoe UI Symbol" w:cs="Segoe UI Symbol"/>
+        </w:rPr>
+        <w:t>⁠</w:t>
+      </w:r>
+      <w:r>
+        <w:t xml:space="preserve">  </w:t>
+      </w:r>
+      <w:r>
+        <w:rPr>
+          <w:rFonts w:ascii="Segoe UI Symbol" w:hAnsi="Segoe UI Symbol" w:cs="Segoe UI Symbol"/>
+        </w:rPr>
+        <w:t>⁠</w:t>
+      </w:r>
+      <w:r>
+        <w:t>Iyzico / Stripe API: Kullanıcının, sistemin Premium versiyonunu kullanabilmesi için yapılacak ödeme altyapılarında kullanılacaktır.</w:t>
+      </w:r>
+    </w:p>
+    <w:p>
+      <w:r>
+        <w:t>•</w:t>
+      </w:r>
+      <w:r>
+        <w:rPr>
+          <w:rFonts w:ascii="Segoe UI Symbol" w:hAnsi="Segoe UI Symbol" w:cs="Segoe UI Symbol"/>
+        </w:rPr>
+        <w:t>⁠</w:t>
+      </w:r>
+      <w:r>
+        <w:t xml:space="preserve">  </w:t>
+      </w:r>
+      <w:r>
+        <w:rPr>
+          <w:rFonts w:ascii="Segoe UI Symbol" w:hAnsi="Segoe UI Symbol" w:cs="Segoe UI Symbol"/>
+        </w:rPr>
+        <w:t>⁠</w:t>
+      </w:r>
+      <w:r>
+        <w:t>AWS S3: Uygulamanın kendi içindeki sosyal akışta paylaşılan yüksek çözünürlüklü maç videolarının ve fotoğraflarının hızlı bir şekilde yüklenmesini ve saklanmasını sağlayacak altyapı sistemini oluşturacaktır.</w:t>
       </w:r>
     </w:p>
     <w:p>
@@ -884,12 +922,12 @@
         <w:pStyle w:val="Balk2"/>
       </w:pPr>
       <w:r>
-        <w:t>2.3 Kullanıcı Sınıfları ve Özellikleri</w:t>
+        <w:t>2.2 Ürün Fonksiyonları</w:t>
       </w:r>
     </w:p>
     <w:p>
       <w:r>
-        <w:t>Sistemi kullanacak kullanıcı tipleri ve temel özellikleri açıklanır.</w:t>
+        <w:t>Sistemin ana fonksiyonları yüksek seviyede listelenir.</w:t>
       </w:r>
     </w:p>
     <w:p>
@@ -897,12 +935,12 @@
         <w:pStyle w:val="Balk2"/>
       </w:pPr>
       <w:r>
-        <w:t>2.4 Çalışma Ortamı</w:t>
+        <w:t>2.3 Kullanıcı Sınıfları ve Özellikleri</w:t>
       </w:r>
     </w:p>
     <w:p>
       <w:r>
-        <w:t>Yazılımın hedef platformu: web, mobil, masaüstü, işletim sistemi, tarayıcı vb.</w:t>
+        <w:t>Sistemi kullanacak kullanıcı tipleri ve temel özellikleri açıklanır.</w:t>
       </w:r>
     </w:p>
     <w:p>
@@ -910,12 +948,12 @@
         <w:pStyle w:val="Balk2"/>
       </w:pPr>
       <w:r>
-        <w:t>2.5 Tasarım ve Uygulama Kısıtları</w:t>
+        <w:t>2.4 Çalışma Ortamı</w:t>
       </w:r>
     </w:p>
     <w:p>
       <w:r>
-        <w:t>Teknoloji seçimi, zaman, bütçe, yasal zorunluluklar, entegrasyon kısıtları vb.</w:t>
+        <w:t>Yazılımın hedef platformu: web, mobil, masaüstü, işletim sistemi, tarayıcı vb.</w:t>
       </w:r>
     </w:p>
     <w:p>
@@ -923,6 +961,20 @@
         <w:pStyle w:val="Balk2"/>
       </w:pPr>
       <w:r>
+        <w:lastRenderedPageBreak/>
+        <w:t>2.5 Tasarım ve Uygulama Kısıtları</w:t>
+      </w:r>
+    </w:p>
+    <w:p>
+      <w:r>
+        <w:t>Teknoloji seçimi, zaman, bütçe, yasal zorunluluklar, entegrasyon kısıtları vb.</w:t>
+      </w:r>
+    </w:p>
+    <w:p>
+      <w:pPr>
+        <w:pStyle w:val="Balk2"/>
+      </w:pPr>
+      <w:r>
         <w:t>2.6 Varsayımlar ve Bağımlılıklar</w:t>
       </w:r>
     </w:p>
@@ -996,7 +1048,6 @@
         <w:pStyle w:val="Balk1"/>
       </w:pPr>
       <w:r>
-        <w:lastRenderedPageBreak/>
         <w:t>4. Sistem Özellikleri / Fonksiyonel Gereksinimler</w:t>
       </w:r>
     </w:p>
@@ -1101,6 +1152,7 @@
     </w:p>
     <w:p>
       <w:r>
+        <w:lastRenderedPageBreak/>
         <w:t>Açıklama:</w:t>
       </w:r>
     </w:p>
@@ -1181,7 +1233,6 @@
         <w:pStyle w:val="Balk2"/>
       </w:pPr>
       <w:r>
-        <w:lastRenderedPageBreak/>
         <w:t>5.4 Güvenilirlik ve Hata Toleransı</w:t>
       </w:r>
     </w:p>
@@ -1302,6 +1353,7 @@
         <w:pStyle w:val="Balk1"/>
       </w:pPr>
       <w:r>
+        <w:lastRenderedPageBreak/>
         <w:t>8. Riskler, Sınırlar ve Açık Noktalar</w:t>
       </w:r>
     </w:p>
@@ -1383,7 +1435,6 @@
         <w:pStyle w:val="Balk1"/>
       </w:pPr>
       <w:r>
-        <w:lastRenderedPageBreak/>
         <w:t>İzlenebilirlik Özeti</w:t>
       </w:r>
     </w:p>

</xml_diff>